<commit_message>
fix: secure proxy trust and update learning documentation
</commit_message>
<xml_diff>
--- a/docs/Bongkey_Project_Progress_Report.docx
+++ b/docs/Bongkey_Project_Progress_Report.docx
@@ -359,13 +359,14 @@
             <w:pPr>
               <w:spacing w:after="0"/>
             </w:pPr>
-            <w:r/>
+            <w:r>
+              <w:t>Version 2.21</w:t>
+            </w:r>
             <w:r>
               <w:rPr>
                 <w:b w:val="0"/>
                 <w:sz w:val="18"/>
               </w:rPr>
-              <w:t>Version 2.20</w:t>
             </w:r>
           </w:p>
         </w:tc>
@@ -442,7 +443,7 @@
     </w:p>
     <w:p>
       <w:r>
-        <w:t>Core MVP security and checkout integrity work is substantially stronger than the original prototype. Private order access, admin authentication, atomic stock reservation, checkout idempotency and real Gmail OTP checkout/recovery are verified. The new admin fulfillment workflow is implemented and has passed automated, race and real PostgreSQL concurrency checks. The valid-owner browser walkthrough passed, so the fulfillment story is Done.</w:t>
+        <w:t>Core MVP security and checkout integrity work is substantially stronger than the original prototype. Private order access, admin authentication, atomic stock reservation, checkout idempotency, real Gmail OTP checkout and recovery, admin fulfillment, and the direct-deployment proxy boundary are verified. The fulfillment change is merged into main; PROXY 01 is the current focused branch change.</w:t>
       </w:r>
     </w:p>
     <w:p>
@@ -450,11 +451,9 @@
         <w:rPr>
           <w:b/>
         </w:rPr>
-        <w:t xml:space="preserve">Important repository state: </w:t>
+        <w:t>Repository state: the verified fulfillment workflow and its progress report were committed, pushed, reviewed in pull request 1, merged into main, and synchronized locally. The current codex/trusted-proxy-fix branch contains only the PROXY 01 code, focused test, PRD update, and this report update.</w:t>
       </w:r>
-      <w:r>
-        <w:t>the latest fulfillment and documentation changes are saved in the local working tree, but the current Git status shows modified and untracked files. This report does not claim that those changes are committed or pushed.</w:t>
-      </w:r>
+      <w:r/>
     </w:p>
     <w:p>
       <w:pPr>
@@ -606,13 +605,14 @@
             <w:pPr>
               <w:spacing w:after="0"/>
             </w:pPr>
-            <w:r/>
+            <w:r>
+              <w:t>8</w:t>
+            </w:r>
             <w:r>
               <w:rPr>
                 <w:b w:val="0"/>
                 <w:sz w:val="18"/>
               </w:rPr>
-              <w:t>7</w:t>
             </w:r>
           </w:p>
         </w:tc>
@@ -631,13 +631,14 @@
             <w:pPr>
               <w:spacing w:after="0"/>
             </w:pPr>
-            <w:r/>
+            <w:r>
+              <w:t>FIX 01, FIX 02, FIX 03, FIX 04, IDEMP 01, EMAIL 01, FULFILL 01 and PROXY 01 have recorded evidence.</w:t>
+            </w:r>
             <w:r>
               <w:rPr>
                 <w:b w:val="0"/>
                 <w:sz w:val="18"/>
               </w:rPr>
-              <w:t>FIX 01, FIX 02, FIX 03, FIX 04, IDEMP 01, EMAIL 01 and FULFILL 01 have recorded evidence.</w:t>
             </w:r>
           </w:p>
         </w:tc>
@@ -1665,6 +1666,115 @@
           </w:p>
         </w:tc>
       </w:tr>
+      <w:tr>
+        <w:trPr>
+          <w:cantSplit/>
+        </w:trPr>
+        <w:tc>
+          <w:tcPr>
+            <w:tcW w:type="dxa" w:w="1181"/>
+            <w:tcMar>
+              <w:top w:w="120" w:type="dxa"/>
+              <w:start w:w="140" w:type="dxa"/>
+              <w:bottom w:w="120" w:type="dxa"/>
+              <w:end w:w="140" w:type="dxa"/>
+            </w:tcMar>
+            <w:vAlign w:val="center"/>
+          </w:tcPr>
+          <w:p>
+            <w:pPr>
+              <w:spacing w:after="0"/>
+            </w:pPr>
+            <w:r>
+              <w:t>PROXY 01</w:t>
+            </w:r>
+            <w:r>
+              <w:rPr>
+                <w:b w:val="0"/>
+                <w:sz w:val="18"/>
+              </w:rPr>
+            </w:r>
+          </w:p>
+        </w:tc>
+        <w:tc>
+          <w:tcPr>
+            <w:tcW w:type="dxa" w:w="1037"/>
+            <w:tcMar>
+              <w:top w:w="120" w:type="dxa"/>
+              <w:start w:w="140" w:type="dxa"/>
+              <w:bottom w:w="120" w:type="dxa"/>
+              <w:end w:w="140" w:type="dxa"/>
+            </w:tcMar>
+            <w:vAlign w:val="center"/>
+          </w:tcPr>
+          <w:p>
+            <w:pPr>
+              <w:spacing w:after="0"/>
+            </w:pPr>
+            <w:r>
+              <w:t>Done</w:t>
+            </w:r>
+            <w:r>
+              <w:rPr>
+                <w:b w:val="0"/>
+                <w:sz w:val="18"/>
+              </w:rPr>
+            </w:r>
+          </w:p>
+        </w:tc>
+        <w:tc>
+          <w:tcPr>
+            <w:tcW w:type="dxa" w:w="2376"/>
+            <w:tcMar>
+              <w:top w:w="120" w:type="dxa"/>
+              <w:start w:w="140" w:type="dxa"/>
+              <w:bottom w:w="120" w:type="dxa"/>
+              <w:end w:w="140" w:type="dxa"/>
+            </w:tcMar>
+            <w:vAlign w:val="center"/>
+          </w:tcPr>
+          <w:p>
+            <w:pPr>
+              <w:spacing w:after="0"/>
+            </w:pPr>
+            <w:r>
+              <w:t>Direct-deployment trusted proxy boundary</w:t>
+            </w:r>
+            <w:r>
+              <w:rPr>
+                <w:b w:val="0"/>
+                <w:sz w:val="18"/>
+              </w:rPr>
+            </w:r>
+          </w:p>
+        </w:tc>
+        <w:tc>
+          <w:tcPr>
+            <w:tcW w:type="dxa" w:w="4925"/>
+            <w:tcMar>
+              <w:top w:w="120" w:type="dxa"/>
+              <w:start w:w="140" w:type="dxa"/>
+              <w:bottom w:w="120" w:type="dxa"/>
+              <w:end w:w="140" w:type="dxa"/>
+            </w:tcMar>
+            <w:vAlign w:val="center"/>
+          </w:tcPr>
+          <w:p>
+            <w:pPr>
+              <w:spacing w:after="0"/>
+            </w:pPr>
+            <w:r>
+              <w:t>Gin trusts no forwarded proxy headers; a focused spoof test, Go vet and the full uncached backend suite passed.</w:t>
+            </w:r>
+            <w:r>
+              <w:rPr>
+                <w:b w:val="0"/>
+                <w:sz w:val="18"/>
+              </w:rPr>
+            </w:r>
+          </w:p>
+        </w:tc>
+      </w:tr>
     </w:tbl>
     <w:p>
       <w:pPr>
@@ -1956,7 +2066,7 @@
               <w:rPr>
                 <w:sz w:val="18"/>
               </w:rPr>
-              <w:t>Registers endpoints and middleware; registration does not execute the handler.</w:t>
+              <w:t>Defines direct-client trust, then registers endpoints and middleware; registration does not execute handlers.</w:t>
             </w:r>
           </w:p>
         </w:tc>
@@ -3241,6 +3351,86 @@
           </w:p>
         </w:tc>
       </w:tr>
+      <w:tr>
+        <w:trPr>
+          <w:cantSplit/>
+        </w:trPr>
+        <w:tc>
+          <w:tcPr>
+            <w:tcW w:type="dxa" w:w="2304"/>
+            <w:tcMar>
+              <w:top w:w="120" w:type="dxa"/>
+              <w:start w:w="140" w:type="dxa"/>
+              <w:bottom w:w="120" w:type="dxa"/>
+              <w:end w:w="140" w:type="dxa"/>
+            </w:tcMar>
+            <w:vAlign w:val="center"/>
+            <w:shd w:fill="F3F4F6"/>
+          </w:tcPr>
+          <w:p>
+            <w:pPr>
+              <w:spacing w:after="0" w:line="259" w:lineRule="auto"/>
+              <w:jc w:val="center"/>
+            </w:pPr>
+            <w:r>
+              <w:rPr>
+                <w:sz w:val="18"/>
+              </w:rPr>
+              <w:t>Forged forwarded client IP</w:t>
+            </w:r>
+          </w:p>
+        </w:tc>
+        <w:tc>
+          <w:tcPr>
+            <w:tcW w:type="dxa" w:w="2880"/>
+            <w:tcMar>
+              <w:top w:w="120" w:type="dxa"/>
+              <w:start w:w="140" w:type="dxa"/>
+              <w:bottom w:w="120" w:type="dxa"/>
+              <w:end w:w="140" w:type="dxa"/>
+            </w:tcMar>
+            <w:vAlign w:val="center"/>
+            <w:shd w:fill="F3F4F6"/>
+          </w:tcPr>
+          <w:p>
+            <w:pPr>
+              <w:spacing w:after="0" w:line="259" w:lineRule="auto"/>
+              <w:jc w:val="left"/>
+            </w:pPr>
+            <w:r>
+              <w:rPr>
+                <w:sz w:val="18"/>
+              </w:rPr>
+              <w:t>Gin trusted-proxy boundary</w:t>
+            </w:r>
+          </w:p>
+        </w:tc>
+        <w:tc>
+          <w:tcPr>
+            <w:tcW w:type="dxa" w:w="4392"/>
+            <w:tcMar>
+              <w:top w:w="120" w:type="dxa"/>
+              <w:start w:w="140" w:type="dxa"/>
+              <w:bottom w:w="120" w:type="dxa"/>
+              <w:end w:w="140" w:type="dxa"/>
+            </w:tcMar>
+            <w:vAlign w:val="center"/>
+            <w:shd w:fill="F3F4F6"/>
+          </w:tcPr>
+          <w:p>
+            <w:pPr>
+              <w:spacing w:after="0" w:line="259" w:lineRule="auto"/>
+              <w:jc w:val="left"/>
+            </w:pPr>
+            <w:r>
+              <w:rPr>
+                <w:sz w:val="18"/>
+              </w:rPr>
+              <w:t>Forwarded header is ignored; the direct peer address remains authoritative.</w:t>
+            </w:r>
+          </w:p>
+        </w:tc>
+      </w:tr>
     </w:tbl>
     <w:p>
       <w:pPr>
@@ -4141,6 +4331,90 @@
           </w:p>
         </w:tc>
       </w:tr>
+      <w:tr>
+        <w:trPr>
+          <w:cantSplit/>
+        </w:trPr>
+        <w:tc>
+          <w:tcPr>
+            <w:tcW w:type="dxa" w:w="2952"/>
+            <w:tcMar>
+              <w:top w:w="120" w:type="dxa"/>
+              <w:start w:w="140" w:type="dxa"/>
+              <w:bottom w:w="120" w:type="dxa"/>
+              <w:end w:w="140" w:type="dxa"/>
+            </w:tcMar>
+            <w:vAlign w:val="center"/>
+            <w:shd w:fill="F3F4F6"/>
+          </w:tcPr>
+          <w:p>
+            <w:pPr>
+              <w:spacing w:after="0" w:line="259" w:lineRule="auto"/>
+              <w:jc w:val="center"/>
+            </w:pPr>
+            <w:r>
+              <w:rPr>
+                <w:sz w:val="18"/>
+              </w:rPr>
+              <w:t>Trusted proxy spoof test</w:t>
+            </w:r>
+          </w:p>
+        </w:tc>
+        <w:tc>
+          <w:tcPr>
+            <w:tcW w:type="dxa" w:w="1224"/>
+            <w:tcMar>
+              <w:top w:w="120" w:type="dxa"/>
+              <w:start w:w="140" w:type="dxa"/>
+              <w:bottom w:w="120" w:type="dxa"/>
+              <w:end w:w="140" w:type="dxa"/>
+            </w:tcMar>
+            <w:vAlign w:val="center"/>
+            <w:shd w:fill="F3F4F6"/>
+          </w:tcPr>
+          <w:p>
+            <w:pPr>
+              <w:spacing w:after="0"/>
+            </w:pPr>
+            <w:r>
+              <w:t>Passed</w:t>
+            </w:r>
+            <w:r>
+              <w:rPr>
+                <w:b w:val="0"/>
+                <w:sz w:val="18"/>
+              </w:rPr>
+            </w:r>
+          </w:p>
+        </w:tc>
+        <w:tc>
+          <w:tcPr>
+            <w:tcW w:type="dxa" w:w="5400"/>
+            <w:tcMar>
+              <w:top w:w="120" w:type="dxa"/>
+              <w:start w:w="140" w:type="dxa"/>
+              <w:bottom w:w="120" w:type="dxa"/>
+              <w:end w:w="140" w:type="dxa"/>
+            </w:tcMar>
+            <w:vAlign w:val="center"/>
+            <w:shd w:fill="F3F4F6"/>
+          </w:tcPr>
+          <w:p>
+            <w:pPr>
+              <w:spacing w:after="0"/>
+            </w:pPr>
+            <w:r>
+              <w:t>Forged X-Forwarded-For was ignored and the direct peer IP was returned.</w:t>
+            </w:r>
+            <w:r>
+              <w:rPr>
+                <w:b w:val="0"/>
+                <w:sz w:val="18"/>
+              </w:rPr>
+            </w:r>
+          </w:p>
+        </w:tc>
+      </w:tr>
     </w:tbl>
     <w:p>
       <w:pPr>
@@ -4326,7 +4600,7 @@
               <w:rPr>
                 <w:sz w:val="18"/>
               </w:rPr>
-              <w:t>Scope, backlog, evidence and release readiness; now version 2.20.</w:t>
+              <w:t>Scope, backlog and evidence; now version 2.21.</w:t>
             </w:r>
           </w:p>
         </w:tc>
@@ -4640,7 +4914,7 @@
               <w:rPr>
                 <w:sz w:val="18"/>
               </w:rPr>
-              <w:t>Protected PATCH admin order status endpoint.</w:t>
+              <w:t>Direct-client trust boundary plus protected PATCH admin order status endpoint.</w:t>
             </w:r>
           </w:p>
         </w:tc>
@@ -4959,6 +5233,83 @@
           </w:p>
         </w:tc>
       </w:tr>
+      <w:tr>
+        <w:trPr>
+          <w:cantSplit/>
+        </w:trPr>
+        <w:tc>
+          <w:tcPr>
+            <w:tcW w:type="dxa" w:w="1800"/>
+            <w:tcMar>
+              <w:top w:w="120" w:type="dxa"/>
+              <w:start w:w="140" w:type="dxa"/>
+              <w:bottom w:w="120" w:type="dxa"/>
+              <w:end w:w="140" w:type="dxa"/>
+            </w:tcMar>
+            <w:vAlign w:val="center"/>
+          </w:tcPr>
+          <w:p>
+            <w:pPr>
+              <w:spacing w:after="0" w:line="259" w:lineRule="auto"/>
+              <w:jc w:val="center"/>
+            </w:pPr>
+            <w:r>
+              <w:rPr>
+                <w:sz w:val="18"/>
+              </w:rPr>
+              <w:t>Proxy boundary test</w:t>
+            </w:r>
+          </w:p>
+        </w:tc>
+        <w:tc>
+          <w:tcPr>
+            <w:tcW w:type="dxa" w:w="3888"/>
+            <w:tcMar>
+              <w:top w:w="120" w:type="dxa"/>
+              <w:start w:w="140" w:type="dxa"/>
+              <w:bottom w:w="120" w:type="dxa"/>
+              <w:end w:w="140" w:type="dxa"/>
+            </w:tcMar>
+            <w:vAlign w:val="center"/>
+          </w:tcPr>
+          <w:p>
+            <w:pPr>
+              <w:spacing w:after="0" w:line="259" w:lineRule="auto"/>
+              <w:jc w:val="left"/>
+            </w:pPr>
+            <w:r>
+              <w:rPr>
+                <w:sz w:val="18"/>
+              </w:rPr>
+              <w:t>backend\internal\routes\routes_test.go</w:t>
+            </w:r>
+          </w:p>
+        </w:tc>
+        <w:tc>
+          <w:tcPr>
+            <w:tcW w:type="dxa" w:w="3888"/>
+            <w:tcMar>
+              <w:top w:w="120" w:type="dxa"/>
+              <w:start w:w="140" w:type="dxa"/>
+              <w:bottom w:w="120" w:type="dxa"/>
+              <w:end w:w="140" w:type="dxa"/>
+            </w:tcMar>
+            <w:vAlign w:val="center"/>
+          </w:tcPr>
+          <w:p>
+            <w:pPr>
+              <w:spacing w:after="0" w:line="259" w:lineRule="auto"/>
+              <w:jc w:val="left"/>
+            </w:pPr>
+            <w:r>
+              <w:rPr>
+                <w:sz w:val="18"/>
+              </w:rPr>
+              <w:t>Proves untrusted forwarded client IP headers cannot spoof the direct peer.</w:t>
+            </w:r>
+          </w:p>
+        </w:tc>
+      </w:tr>
     </w:tbl>
     <w:p>
       <w:pPr>
@@ -5120,13 +5471,14 @@
             <w:pPr>
               <w:spacing w:after="0"/>
             </w:pPr>
-            <w:r/>
+            <w:r>
+              <w:t>1</w:t>
+            </w:r>
             <w:r>
               <w:rPr>
                 <w:b w:val="0"/>
                 <w:sz w:val="18"/>
               </w:rPr>
-              <w:t>1</w:t>
             </w:r>
           </w:p>
         </w:tc>
@@ -5151,7 +5503,7 @@
               <w:rPr>
                 <w:sz w:val="18"/>
               </w:rPr>
-              <w:t>Trusted proxy boundary</w:t>
+              <w:t>Authoritative pricing and delivery</w:t>
             </w:r>
           </w:p>
         </w:tc>
@@ -5176,7 +5528,7 @@
               <w:rPr>
                 <w:sz w:val="18"/>
               </w:rPr>
-              <w:t>Remove the Gin all-proxies-trusted warning before any public deployment or IP-based rate-limit decision.</w:t>
+              <w:t>Replace hardcoded delivery fee and incomplete lens pricing with backend-owned calculations and snapshots.</w:t>
             </w:r>
           </w:p>
         </w:tc>
@@ -5191,108 +5543,6 @@
             </w:tcMar>
             <w:vAlign w:val="center"/>
             <w:shd w:fill="F3F4F6"/>
-          </w:tcPr>
-          <w:p>
-            <w:pPr>
-              <w:spacing w:after="0" w:line="259" w:lineRule="auto"/>
-              <w:jc w:val="left"/>
-            </w:pPr>
-            <w:r>
-              <w:rPr>
-                <w:sz w:val="18"/>
-              </w:rPr>
-              <w:t>1 to 3 h</w:t>
-            </w:r>
-          </w:p>
-        </w:tc>
-      </w:tr>
-      <w:tr>
-        <w:trPr>
-          <w:cantSplit/>
-        </w:trPr>
-        <w:tc>
-          <w:tcPr>
-            <w:tcW w:type="dxa" w:w="792"/>
-            <w:tcMar>
-              <w:top w:w="120" w:type="dxa"/>
-              <w:start w:w="140" w:type="dxa"/>
-              <w:bottom w:w="120" w:type="dxa"/>
-              <w:end w:w="140" w:type="dxa"/>
-            </w:tcMar>
-            <w:vAlign w:val="center"/>
-          </w:tcPr>
-          <w:p>
-            <w:pPr>
-              <w:spacing w:after="0"/>
-            </w:pPr>
-            <w:r/>
-            <w:r>
-              <w:rPr>
-                <w:b w:val="0"/>
-                <w:sz w:val="18"/>
-              </w:rPr>
-              <w:t>2</w:t>
-            </w:r>
-          </w:p>
-        </w:tc>
-        <w:tc>
-          <w:tcPr>
-            <w:tcW w:type="dxa" w:w="2376"/>
-            <w:tcMar>
-              <w:top w:w="120" w:type="dxa"/>
-              <w:start w:w="140" w:type="dxa"/>
-              <w:bottom w:w="120" w:type="dxa"/>
-              <w:end w:w="140" w:type="dxa"/>
-            </w:tcMar>
-            <w:vAlign w:val="center"/>
-          </w:tcPr>
-          <w:p>
-            <w:pPr>
-              <w:spacing w:after="0" w:line="259" w:lineRule="auto"/>
-              <w:jc w:val="left"/>
-            </w:pPr>
-            <w:r>
-              <w:rPr>
-                <w:sz w:val="18"/>
-              </w:rPr>
-              <w:t>Authoritative pricing and delivery</w:t>
-            </w:r>
-          </w:p>
-        </w:tc>
-        <w:tc>
-          <w:tcPr>
-            <w:tcW w:type="dxa" w:w="5112"/>
-            <w:tcMar>
-              <w:top w:w="120" w:type="dxa"/>
-              <w:start w:w="140" w:type="dxa"/>
-              <w:bottom w:w="120" w:type="dxa"/>
-              <w:end w:w="140" w:type="dxa"/>
-            </w:tcMar>
-            <w:vAlign w:val="center"/>
-          </w:tcPr>
-          <w:p>
-            <w:pPr>
-              <w:spacing w:after="0" w:line="259" w:lineRule="auto"/>
-              <w:jc w:val="left"/>
-            </w:pPr>
-            <w:r>
-              <w:rPr>
-                <w:sz w:val="18"/>
-              </w:rPr>
-              <w:t>Replace the hardcoded delivery fee and incomplete lens-price behavior with backend-owned calculations and snapshots.</w:t>
-            </w:r>
-          </w:p>
-        </w:tc>
-        <w:tc>
-          <w:tcPr>
-            <w:tcW w:type="dxa" w:w="1368"/>
-            <w:tcMar>
-              <w:top w:w="120" w:type="dxa"/>
-              <w:start w:w="140" w:type="dxa"/>
-              <w:bottom w:w="120" w:type="dxa"/>
-              <w:end w:w="140" w:type="dxa"/>
-            </w:tcMar>
-            <w:vAlign w:val="center"/>
           </w:tcPr>
           <w:p>
             <w:pPr>
@@ -5322,19 +5572,19 @@
               <w:end w:w="140" w:type="dxa"/>
             </w:tcMar>
             <w:vAlign w:val="center"/>
-            <w:shd w:fill="F3F4F6"/>
           </w:tcPr>
           <w:p>
             <w:pPr>
               <w:spacing w:after="0"/>
             </w:pPr>
-            <w:r/>
+            <w:r>
+              <w:t>2</w:t>
+            </w:r>
             <w:r>
               <w:rPr>
                 <w:b w:val="0"/>
                 <w:sz w:val="18"/>
               </w:rPr>
-              <w:t>3</w:t>
             </w:r>
           </w:p>
         </w:tc>
@@ -5348,7 +5598,6 @@
               <w:end w:w="140" w:type="dxa"/>
             </w:tcMar>
             <w:vAlign w:val="center"/>
-            <w:shd w:fill="F3F4F6"/>
           </w:tcPr>
           <w:p>
             <w:pPr>
@@ -5373,7 +5622,6 @@
               <w:end w:w="140" w:type="dxa"/>
             </w:tcMar>
             <w:vAlign w:val="center"/>
-            <w:shd w:fill="F3F4F6"/>
           </w:tcPr>
           <w:p>
             <w:pPr>
@@ -5398,7 +5646,6 @@
               <w:end w:w="140" w:type="dxa"/>
             </w:tcMar>
             <w:vAlign w:val="center"/>
-            <w:shd w:fill="F3F4F6"/>
           </w:tcPr>
           <w:p>
             <w:pPr>
@@ -5428,18 +5675,20 @@
               <w:end w:w="140" w:type="dxa"/>
             </w:tcMar>
             <w:vAlign w:val="center"/>
+            <w:shd w:fill="F3F4F6"/>
           </w:tcPr>
           <w:p>
             <w:pPr>
               <w:spacing w:after="0"/>
             </w:pPr>
-            <w:r/>
+            <w:r>
+              <w:t>3</w:t>
+            </w:r>
             <w:r>
               <w:rPr>
                 <w:b w:val="0"/>
                 <w:sz w:val="18"/>
               </w:rPr>
-              <w:t>4</w:t>
             </w:r>
           </w:p>
         </w:tc>
@@ -5453,6 +5702,7 @@
               <w:end w:w="140" w:type="dxa"/>
             </w:tcMar>
             <w:vAlign w:val="center"/>
+            <w:shd w:fill="F3F4F6"/>
           </w:tcPr>
           <w:p>
             <w:pPr>
@@ -5477,6 +5727,7 @@
               <w:end w:w="140" w:type="dxa"/>
             </w:tcMar>
             <w:vAlign w:val="center"/>
+            <w:shd w:fill="F3F4F6"/>
           </w:tcPr>
           <w:p>
             <w:pPr>
@@ -5487,7 +5738,7 @@
               <w:rPr>
                 <w:sz w:val="18"/>
               </w:rPr>
-              <w:t>Demonstrate catalog to cart to verified checkout to invoice to fulfillment, including failures and cleanup.</w:t>
+              <w:t>Demonstrate catalog to verified checkout to invoice to fulfillment, including failures and cleanup.</w:t>
             </w:r>
           </w:p>
         </w:tc>
@@ -5501,6 +5752,7 @@
               <w:end w:w="140" w:type="dxa"/>
             </w:tcMar>
             <w:vAlign w:val="center"/>
+            <w:shd w:fill="F3F4F6"/>
           </w:tcPr>
           <w:p>
             <w:pPr>
@@ -5530,19 +5782,19 @@
               <w:end w:w="140" w:type="dxa"/>
             </w:tcMar>
             <w:vAlign w:val="center"/>
-            <w:shd w:fill="F3F4F6"/>
           </w:tcPr>
           <w:p>
             <w:pPr>
               <w:spacing w:after="0"/>
             </w:pPr>
-            <w:r/>
+            <w:r>
+              <w:t>4</w:t>
+            </w:r>
             <w:r>
               <w:rPr>
                 <w:b w:val="0"/>
                 <w:sz w:val="18"/>
               </w:rPr>
-              <w:t>5</w:t>
             </w:r>
           </w:p>
         </w:tc>
@@ -5556,7 +5808,6 @@
               <w:end w:w="140" w:type="dxa"/>
             </w:tcMar>
             <w:vAlign w:val="center"/>
-            <w:shd w:fill="F3F4F6"/>
           </w:tcPr>
           <w:p>
             <w:pPr>
@@ -5581,7 +5832,6 @@
               <w:end w:w="140" w:type="dxa"/>
             </w:tcMar>
             <w:vAlign w:val="center"/>
-            <w:shd w:fill="F3F4F6"/>
           </w:tcPr>
           <w:p>
             <w:pPr>
@@ -5592,7 +5842,7 @@
               <w:rPr>
                 <w:sz w:val="18"/>
               </w:rPr>
-              <w:t>Backups, recovery, monitoring, production secrets, owner-led Docker/CI/deployment practice and pilot acceptance.</w:t>
+              <w:t>Backups, recovery, monitoring, production secrets, owner-led Docker, CI and deployment practice, and pilot acceptance.</w:t>
             </w:r>
           </w:p>
         </w:tc>
@@ -5606,7 +5856,6 @@
               <w:end w:w="140" w:type="dxa"/>
             </w:tcMar>
             <w:vAlign w:val="center"/>
-            <w:shd w:fill="F3F4F6"/>
           </w:tcPr>
           <w:p>
             <w:pPr>
@@ -5753,11 +6002,9 @@
         <w:rPr>
           <w:b/>
         </w:rPr>
-        <w:t xml:space="preserve">[ ] </w:t>
+        <w:t>[x] Fulfillment changes were committed, pushed, merged through pull request 1, and synchronized to local main.</w:t>
       </w:r>
-      <w:r>
-        <w:t>Commit the reviewed local changes before pushing; inspect the diff and keep secrets out of Git.</w:t>
-      </w:r>
+      <w:r/>
     </w:p>
     <w:p>
       <w:pPr>
@@ -5772,7 +6019,7 @@
         <w:pStyle w:val="ListBullet"/>
       </w:pPr>
       <w:r>
-        <w:t>The latest local working tree contains modified and untracked files. Commit and push status is not verified by this report.</w:t>
+        <w:t>PROXY 01 is implemented on codex/trusted-proxy-fix and is not yet committed or merged. Keep .env and all credentials outside Git when reviewing this branch.</w:t>
       </w:r>
     </w:p>
     <w:p>
@@ -5780,7 +6027,7 @@
         <w:pStyle w:val="ListBullet"/>
       </w:pPr>
       <w:r>
-        <w:t>Gin still warns that all proxies are trusted. Do not rely on forwarded client IP behavior before configuration is fixed.</w:t>
+        <w:t>Gin now ignores forwarded client IP headers for the current direct deployment. If Nginx, Cloudflare, or another reverse proxy is introduced, configure only its exact trusted proxy addresses before relying on client IPs.</w:t>
       </w:r>
     </w:p>
     <w:p>
@@ -5805,7 +6052,7 @@
         <w:spacing w:before="160"/>
       </w:pPr>
       <w:r>
-        <w:t>Recommended next decision: select one small FLOW 01 story for authoritative pricing and delivery instead of starting several Phase 2 features together.</w:t>
+        <w:t>Recommended next decision after PROXY 01 is merged: split one small FLOW 01 story for backend-owned pricing and delivery calculations instead of starting several Phase 2 features together.</w:t>
       </w:r>
     </w:p>
     <w:sectPr>

</xml_diff>